<commit_message>
Rev D1: update EVT-PRE-20 test program and methods
</commit_message>
<xml_diff>
--- a/releases/evt-pre-20/2026-09-30-rev-d/Программа_EVT_и_Мухоед/01_Программы_и_формы/Программа_и_методики_EVT_PRE_20.docx
+++ b/releases/evt-pre-20/2026-09-30-rev-d/Программа_EVT_и_Мухоед/01_Программы_и_формы/Программа_и_методики_EVT_PRE_20.docx
@@ -41,10 +41,10 @@
       </w:pPr>
       <w:r>
         <w:rPr>
-          <w:rFonts w:ascii="Times New Roman" w:hAnsi="Times New Roman" w:eastAsia="Times New Roman" w:cs="Times New Roman"/>
+          <w:rFonts w:ascii="Times New Roman" w:hAnsi="Times New Roman"/>
           <w:sz w:val="28"/>
         </w:rPr>
-        <w:t>Программа относится к фактически собранному первому лоту 20 станций. Исходные протоколы host или серверного replay не заменяют аппаратные измерения. Результат каждого испытания привязывается к серийному номеру, ревизии аппаратуры и версии прошивки.</w:t>
+        <w:t>Программа относится к первому лоту из 20 фактически собранных станций. Для него заказаны полные партии 22 PCB-MAIN, 22 PCB-PWR и 80 PCB-MIC PCBA без остановки после первых образцов; две MAIN и две PWR остаются резервом. Исходные протоколы host или серверного replay не заменяют аппаратные измерения. Каждый результат связывается с серийным номером, ревизией и версией прошивки.</w:t>
       </w:r>
     </w:p>
     <w:p>
@@ -117,10 +117,10 @@
       </w:pPr>
       <w:r>
         <w:rPr>
-          <w:rFonts w:ascii="Times New Roman" w:hAnsi="Times New Roman" w:eastAsia="Times New Roman" w:cs="Times New Roman"/>
+          <w:rFonts w:ascii="Times New Roman" w:hAnsi="Times New Roman"/>
           <w:sz w:val="28"/>
         </w:rPr>
-        <w:t>Сначала проверить комплектность и контрольные суммы, входной контроль, оснастку и эталонные образцы. Затем собрать весь лот с индивидуальными travellers и выполнить 100 % EOL. После базового функционального EVT провести назначенные температурные, влаговые, механические, RF, акустические, энергетические и полевые проверки. После каждого стресса повторить критические функции и закрыть отклонения.</w:t>
+        <w:t>До запуска панелей фабрика подтверждает фактические стеки, DFM и обработку 76 из 76 переходов PCB-MAIN. Затем проверяются комплектность, контрольные суммы, входной контроль и оснастка; вся партия плат производится без паузы. После монтажа выбирают два PCB-MAIN, два PCB-PWR и одну PCB-MIC или панель для углублённой проверки, не задерживая изготовление остальных. Все 20 собранных станций проходят индивидуальный EOL; далее назначенные температурные, механические, RF, акустические, энергетические и полевые испытания. После стресса повторяют критические функции и закрывают отклонения.</w:t>
       </w:r>
     </w:p>
     <w:p>
@@ -145,10 +145,10 @@
       </w:pPr>
       <w:r>
         <w:rPr>
-          <w:rFonts w:ascii="Times New Roman" w:hAnsi="Times New Roman" w:eastAsia="Times New Roman" w:cs="Times New Roman"/>
+          <w:rFonts w:ascii="Times New Roman" w:hAnsi="Times New Roman"/>
           <w:sz w:val="28"/>
         </w:rPr>
-        <w:t>Проверить корректность питания, предохранителя, cold charge inhibit, температурное поведение батареи/MPPT, RF и GNSS coexistence, ориентацию и акустическую передачу микрофонных pods. Пределы Pd/FAR, дистанции, локализации, ветровой нагрузки и IP должны быть утверждены заказчиком до формального PASS.</w:t>
+        <w:t>Проверить питание, предохранитель, запрет холодного заряда RB40, работу MPPT и 80 Вт солнечной панели, три установленных антенных тракта и GNSS/RF coexistence, ориентацию и акустическую передачу четырёх микрофонных модулей. PCB-MAIN испытывается по фактической трассировке без заказанного контролируемого импеданса и без гарантии 50 Ом. Пределы Pd/FAR, дальности, локализации, RF, ветровой нагрузки и IP утверждаются заказчиком до формального PASS.</w:t>
       </w:r>
     </w:p>
     <w:p>
@@ -206,11 +206,11 @@
       </w:pPr>
       <w:r>
         <w:rPr>
-          <w:rFonts w:ascii="Times New Roman" w:hAnsi="Times New Roman" w:eastAsia="Times New Roman" w:cs="Times New Roman"/>
+          <w:rFonts w:ascii="Times New Roman" w:hAnsi="Times New Roman"/>
           <w:b/>
           <w:sz w:val="28"/>
         </w:rPr>
-        <w:t>Управляемые первые изделия Rev D</w:t>
+        <w:t>Контроль полной партии плат и печатных корпусов</w:t>
       </w:r>
     </w:p>
     <w:p>
@@ -221,10 +221,10 @@
       </w:pPr>
       <w:r>
         <w:rPr>
-          <w:rFonts w:ascii="Times New Roman" w:hAnsi="Times New Roman" w:eastAsia="Times New Roman" w:cs="Times New Roman"/>
+          <w:rFonts w:ascii="Times New Roman" w:hAnsi="Times New Roman"/>
           <w:sz w:val="28"/>
         </w:rPr>
-        <w:t>После изготовления всей партии PCB-MIC выбрать плату или панель и проверить открытый порт Ø0,8, монтаж MK1 и PDM. При дефекте изолировать и проверить затронутую партию. До размножения жгутов принять один полный комплект по обжиму, распайке, сопротивлению и установленной трассе.</w:t>
+        <w:t>После изготовления всех 80 PCB-MIC проверить по AOI каждую плату, а выбранную плату или панель дополнительно проверить по открытому порту Ø0,80 мм, монтажу MK1 и PDM. При дефекте изолировать затронутую партию. Первый лот из 20 корпусов изготавливается 3D-печатью по предварительным моделям с обязательной примеркой, проверкой прочности, герметизации и акустики; второй лот также может быть печатным. Литьевые модели остаются предварительными данными для DFM. До размножения жгутов принять один полный комплект по обжиму, распайке, сопротивлению и установленной трассе. Пошаговые процедуры и состав evidence приведены в отдельном документе «Методики_испытаний_EVT_PRE_20.docx».</w:t>
       </w:r>
     </w:p>
     <w:sectPr>

</xml_diff>

<commit_message>
Promote EVT-PRE-20 Rev D1 test program to release branches
</commit_message>
<xml_diff>
--- a/releases/evt-pre-20/2026-09-30-rev-d/Программа_EVT_и_Мухоед/01_Программы_и_формы/Программа_и_методики_EVT_PRE_20.docx
+++ b/releases/evt-pre-20/2026-09-30-rev-d/Программа_EVT_и_Мухоед/01_Программы_и_формы/Программа_и_методики_EVT_PRE_20.docx
@@ -41,10 +41,10 @@
       </w:pPr>
       <w:r>
         <w:rPr>
-          <w:rFonts w:ascii="Times New Roman" w:hAnsi="Times New Roman" w:eastAsia="Times New Roman" w:cs="Times New Roman"/>
+          <w:rFonts w:ascii="Times New Roman" w:hAnsi="Times New Roman"/>
           <w:sz w:val="28"/>
         </w:rPr>
-        <w:t>Программа относится к фактически собранному первому лоту 20 станций. Исходные протоколы host или серверного replay не заменяют аппаратные измерения. Результат каждого испытания привязывается к серийному номеру, ревизии аппаратуры и версии прошивки.</w:t>
+        <w:t>Программа относится к первому лоту из 20 фактически собранных станций. Для него заказаны полные партии 22 PCB-MAIN, 22 PCB-PWR и 80 PCB-MIC PCBA без остановки после первых образцов; две MAIN и две PWR остаются резервом. Исходные протоколы host или серверного replay не заменяют аппаратные измерения. Каждый результат связывается с серийным номером, ревизией и версией прошивки.</w:t>
       </w:r>
     </w:p>
     <w:p>
@@ -117,10 +117,10 @@
       </w:pPr>
       <w:r>
         <w:rPr>
-          <w:rFonts w:ascii="Times New Roman" w:hAnsi="Times New Roman" w:eastAsia="Times New Roman" w:cs="Times New Roman"/>
+          <w:rFonts w:ascii="Times New Roman" w:hAnsi="Times New Roman"/>
           <w:sz w:val="28"/>
         </w:rPr>
-        <w:t>Сначала проверить комплектность и контрольные суммы, входной контроль, оснастку и эталонные образцы. Затем собрать весь лот с индивидуальными travellers и выполнить 100 % EOL. После базового функционального EVT провести назначенные температурные, влаговые, механические, RF, акустические, энергетические и полевые проверки. После каждого стресса повторить критические функции и закрыть отклонения.</w:t>
+        <w:t>До запуска панелей фабрика подтверждает фактические стеки, DFM и обработку 76 из 76 переходов PCB-MAIN. Затем проверяются комплектность, контрольные суммы, входной контроль и оснастка; вся партия плат производится без паузы. После монтажа выбирают два PCB-MAIN, два PCB-PWR и одну PCB-MIC или панель для углублённой проверки, не задерживая изготовление остальных. Все 20 собранных станций проходят индивидуальный EOL; далее назначенные температурные, механические, RF, акустические, энергетические и полевые испытания. После стресса повторяют критические функции и закрывают отклонения.</w:t>
       </w:r>
     </w:p>
     <w:p>
@@ -145,10 +145,10 @@
       </w:pPr>
       <w:r>
         <w:rPr>
-          <w:rFonts w:ascii="Times New Roman" w:hAnsi="Times New Roman" w:eastAsia="Times New Roman" w:cs="Times New Roman"/>
+          <w:rFonts w:ascii="Times New Roman" w:hAnsi="Times New Roman"/>
           <w:sz w:val="28"/>
         </w:rPr>
-        <w:t>Проверить корректность питания, предохранителя, cold charge inhibit, температурное поведение батареи/MPPT, RF и GNSS coexistence, ориентацию и акустическую передачу микрофонных pods. Пределы Pd/FAR, дистанции, локализации, ветровой нагрузки и IP должны быть утверждены заказчиком до формального PASS.</w:t>
+        <w:t>Проверить питание, предохранитель, запрет холодного заряда RB40, работу MPPT и 80 Вт солнечной панели, три установленных антенных тракта и GNSS/RF coexistence, ориентацию и акустическую передачу четырёх микрофонных модулей. PCB-MAIN испытывается по фактической трассировке без заказанного контролируемого импеданса и без гарантии 50 Ом. Пределы Pd/FAR, дальности, локализации, RF, ветровой нагрузки и IP утверждаются заказчиком до формального PASS.</w:t>
       </w:r>
     </w:p>
     <w:p>
@@ -206,11 +206,11 @@
       </w:pPr>
       <w:r>
         <w:rPr>
-          <w:rFonts w:ascii="Times New Roman" w:hAnsi="Times New Roman" w:eastAsia="Times New Roman" w:cs="Times New Roman"/>
+          <w:rFonts w:ascii="Times New Roman" w:hAnsi="Times New Roman"/>
           <w:b/>
           <w:sz w:val="28"/>
         </w:rPr>
-        <w:t>Управляемые первые изделия Rev D</w:t>
+        <w:t>Контроль полной партии плат и печатных корпусов</w:t>
       </w:r>
     </w:p>
     <w:p>
@@ -221,10 +221,10 @@
       </w:pPr>
       <w:r>
         <w:rPr>
-          <w:rFonts w:ascii="Times New Roman" w:hAnsi="Times New Roman" w:eastAsia="Times New Roman" w:cs="Times New Roman"/>
+          <w:rFonts w:ascii="Times New Roman" w:hAnsi="Times New Roman"/>
           <w:sz w:val="28"/>
         </w:rPr>
-        <w:t>После изготовления всей партии PCB-MIC выбрать плату или панель и проверить открытый порт Ø0,8, монтаж MK1 и PDM. При дефекте изолировать и проверить затронутую партию. До размножения жгутов принять один полный комплект по обжиму, распайке, сопротивлению и установленной трассе.</w:t>
+        <w:t>После изготовления всех 80 PCB-MIC проверить по AOI каждую плату, а выбранную плату или панель дополнительно проверить по открытому порту Ø0,80 мм, монтажу MK1 и PDM. При дефекте изолировать затронутую партию. Первый лот из 20 корпусов изготавливается 3D-печатью по предварительным моделям с обязательной примеркой, проверкой прочности, герметизации и акустики; второй лот также может быть печатным. Литьевые модели остаются предварительными данными для DFM. До размножения жгутов принять один полный комплект по обжиму, распайке, сопротивлению и установленной трассе. Пошаговые процедуры и состав evidence приведены в отдельном документе «Методики_испытаний_EVT_PRE_20.docx».</w:t>
       </w:r>
     </w:p>
     <w:sectPr>

</xml_diff>